<commit_message>
HĐ phần ngầm sau thương thảo: chỉ bỏ cụm back to back và Hợp đồng thầu chính, giữ nguyên nội dung khác
Co-Authored-By: Claude Opus 5.5 <noreply@anthropic.com>
Claude-Session: https://claude.ai/code/session_013kfHyeUKSX8YviAMfNrZNJ
</commit_message>
<xml_diff>
--- a/3. DỰ THẢO HĐ/17.10.2026 Báo cáo rủi ro và kiến nghị FIDIC - HĐ phần ngầm sau thương thảo.docx
+++ b/3. DỰ THẢO HĐ/17.10.2026 Báo cáo rủi ro và kiến nghị FIDIC - HĐ phần ngầm sau thương thảo.docx
@@ -168,7 +168,7 @@
           <w:sz w:val="26"/>
           <w:szCs w:val="26"/>
         </w:rPr>
-        <w:t xml:space="preserve">- Bản gốc: bản chỉnh sửa của Phục Hưng (PH), đã chấp nhận toàn bộ sửa đổi của PH. Mọi điều chỉnh của Bên A thể hiện bằng track changes, tác giả “VNCN E&amp;C – Thương thảo 17/10”, kèm 30 ý kiến (comment) giải thích. Nhờ vậy PH chỉ cần xem phần khác với bản của chính họ.</w:t>
+        <w:t xml:space="preserve">- Bản gốc: bản chỉnh sửa của Phục Hưng (PH), đã chấp nhận toàn bộ sửa đổi của PH. Mọi điều chỉnh của Bên A thể hiện bằng track changes, tác giả “VNCN E&amp;C – Thương thảo 17/10”, kèm 31 ý kiến (comment) giải thích. Nhờ vậy PH chỉ cần xem phần khác với bản của chính họ.</w:t>
       </w:r>
     </w:p>
     <w:p>
@@ -182,7 +182,7 @@
           <w:sz w:val="26"/>
           <w:szCs w:val="26"/>
         </w:rPr>
-        <w:t xml:space="preserve">- Áp dụng đầy đủ biên bản thương thảo 17/10/2026: điều kiện chung (bỏ back to back, bỏ Hợp đồng thầu chính, nguyên tắc khắc phục – bồi thường thống nhất, gom điều khoản về Điều 15–18, giữ nguyên các nội dung liên quan TVGS) và 34 điều kiện riêng.</w:t>
+        <w:t xml:space="preserve">- Áp dụng đầy đủ biên bản thương thảo 17/10/2026: điều kiện chung (chỉ bỏ thuật ngữ “back to back” và “Hợp đồng thầu chính”, giữ nguyên các nội dung khác; nguyên tắc khắc phục – bồi thường thống nhất, gom điều khoản về Điều 15–18, giữ nguyên các nội dung liên quan TVGS) và 34 điều kiện riêng.</w:t>
       </w:r>
     </w:p>
     <w:p>
@@ -210,7 +210,7 @@
           <w:sz w:val="26"/>
           <w:szCs w:val="26"/>
         </w:rPr>
-        <w:t xml:space="preserve">- Kết quả: 109 đoạn sửa, 109 đoạn xóa (phần lớn là chuyển vị trí), 31 đoạn chèn. Kèm bản sạch đã chấp nhận toàn bộ thay đổi để đọc.</w:t>
+        <w:t xml:space="preserve">- Kết quả: 107 đoạn sửa, 108 đoạn xóa (phần lớn là chuyển vị trí), 31 đoạn chèn, 31 ý kiến. Kèm bản sạch đã chấp nhận toàn bộ thay đổi để đọc.</w:t>
       </w:r>
     </w:p>
     <w:p>
@@ -460,7 +460,7 @@
                 <w:sz w:val="20"/>
                 <w:szCs w:val="20"/>
               </w:rPr>
-              <w:t xml:space="preserve">Bỏ 1.13 Hợp đồng thầu chính, 1.20 Phần ngầm; đánh lại số 1.13–1.24; 1.23 Công trường theo biên bản</w:t>
+              <w:t xml:space="preserve">Bỏ 1.13 Hợp đồng thầu chính (chỉ bỏ thuật ngữ), 1.20 Phần ngầm; đánh lại số 1.13–1.24; 1.23 Công trường theo biên bản</w:t>
             </w:r>
           </w:p>
         </w:tc>
@@ -1582,7 +1582,7 @@
                 <w:sz w:val="20"/>
                 <w:szCs w:val="20"/>
               </w:rPr>
-              <w:t xml:space="preserve">Bỏ định nghĩa, nội dung back to back và Hợp đồng thầu chính</w:t>
+              <w:t xml:space="preserve">Bỏ “back to back” và “Hợp đồng thầu chính”</w:t>
             </w:r>
           </w:p>
         </w:tc>
@@ -1616,7 +1616,7 @@
                 <w:sz w:val="20"/>
                 <w:szCs w:val="20"/>
               </w:rPr>
-              <w:t xml:space="preserve">Xóa căn cứ HĐ tổng thầu, định nghĩa 1.13; bỏ cụm “HĐ thầu chính” ở 1.22, 1.26, 8.2, 10.3.2b, 12.2.5a, 17.2a(iv), logo 12.2.11; không còn chữ “back to back”</w:t>
+              <w:t xml:space="preserve">Chỉ bỏ định nghĩa 1.13 và cụm từ “Hợp đồng thầu chính”, “back to back” tại 1.22, 1.26, 8.2, 10.3.2b, 12.2.5a, 17.2a(iv); giữ nguyên toàn bộ nội dung khác (căn cứ Hợp đồng tổng thầu, ràng buộc thời hạn bảo hành không ngắn hơn cam kết với CĐT, các nghĩa vụ gắn với CĐT, TVGS)</w:t>
             </w:r>
           </w:p>
         </w:tc>
@@ -2182,7 +2182,7 @@
                 <w:sz w:val="20"/>
                 <w:szCs w:val="20"/>
               </w:rPr>
-              <w:t xml:space="preserve">Xóa; viết thường “phần ngầm” ở 12.2.1 f, h</w:t>
+              <w:t xml:space="preserve">Xóa định nghĩa; giữ nguyên cách viết ở các điều khác</w:t>
             </w:r>
           </w:p>
         </w:tc>
@@ -3605,7 +3605,7 @@
                 <w:sz w:val="20"/>
                 <w:szCs w:val="20"/>
               </w:rPr>
-              <w:t xml:space="preserve">8.2: 36 tháng từ khi CĐT nghiệm thu hạng mục, bỏ ràng buộc HĐ thầu chính</w:t>
+              <w:t xml:space="preserve">8.2: 36 tháng từ khi CĐT nghiệm thu hạng mục, không ngắn hơn thời hạn Bên A cam kết với CĐT (chỉ bỏ cụm “HĐ thầu chính”)</w:t>
             </w:r>
           </w:p>
         </w:tc>

</xml_diff>

<commit_message>
HĐ phần ngầm: chỉ bỏ back to back, giữ nguyên Hợp đồng thầu chính (bản 17.10, bản FIDIC, báo cáo)
Co-Authored-By: Claude Opus 5.5 <noreply@anthropic.com>
Claude-Session: https://claude.ai/code/session_013kfHyeUKSX8YviAMfNrZNJ
</commit_message>
<xml_diff>
--- a/3. DỰ THẢO HĐ/17.10.2026 Báo cáo rủi ro và kiến nghị FIDIC - HĐ phần ngầm sau thương thảo.docx
+++ b/3. DỰ THẢO HĐ/17.10.2026 Báo cáo rủi ro và kiến nghị FIDIC - HĐ phần ngầm sau thương thảo.docx
@@ -182,7 +182,7 @@
           <w:sz w:val="26"/>
           <w:szCs w:val="26"/>
         </w:rPr>
-        <w:t xml:space="preserve">- Áp dụng đầy đủ biên bản thương thảo 17/10/2026: điều kiện chung (chỉ bỏ thuật ngữ “back to back” và “Hợp đồng thầu chính”, giữ nguyên các nội dung khác; nguyên tắc khắc phục – bồi thường thống nhất, gom điều khoản về Điều 15–18, giữ nguyên các nội dung liên quan TVGS) và 34 điều kiện riêng.</w:t>
+        <w:t xml:space="preserve">- Áp dụng đầy đủ biên bản thương thảo 17/10/2026: điều kiện chung (chỉ bỏ “back to back”, giữ nguyên “Hợp đồng thầu chính” và toàn bộ nội dung liên quan; nguyên tắc khắc phục – bồi thường thống nhất, gom điều khoản về Điều 15–18, giữ nguyên các nội dung liên quan TVGS) và 34 điều kiện riêng.</w:t>
       </w:r>
     </w:p>
     <w:p>
@@ -210,7 +210,7 @@
           <w:sz w:val="26"/>
           <w:szCs w:val="26"/>
         </w:rPr>
-        <w:t xml:space="preserve">- Kết quả: 107 đoạn sửa, 108 đoạn xóa (phần lớn là chuyển vị trí), 31 đoạn chèn, 31 ý kiến. Kèm bản sạch đã chấp nhận toàn bộ thay đổi để đọc.</w:t>
+        <w:t xml:space="preserve">- Kết quả: 100 đoạn sửa, 107 đoạn xóa (phần lớn là chuyển vị trí), 31 đoạn chèn, 31 ý kiến. Kèm bản sạch đã chấp nhận toàn bộ thay đổi để đọc.</w:t>
       </w:r>
     </w:p>
     <w:p>
@@ -460,7 +460,7 @@
                 <w:sz w:val="20"/>
                 <w:szCs w:val="20"/>
               </w:rPr>
-              <w:t xml:space="preserve">Bỏ 1.13 Hợp đồng thầu chính (chỉ bỏ thuật ngữ), 1.20 Phần ngầm; đánh lại số 1.13–1.24; 1.23 Công trường theo biên bản</w:t>
+              <w:t xml:space="preserve">Giữ nguyên 1.13 Hợp đồng thầu chính; bỏ 1.20 Phần ngầm (đồng ý PH), đánh lại số 1.20–1.25; 1.24 Công trường theo biên bản</w:t>
             </w:r>
           </w:p>
         </w:tc>
@@ -1582,7 +1582,7 @@
                 <w:sz w:val="20"/>
                 <w:szCs w:val="20"/>
               </w:rPr>
-              <w:t xml:space="preserve">Bỏ “back to back” và “Hợp đồng thầu chính”</w:t>
+              <w:t xml:space="preserve">Chỉ bỏ “back to back”; giữ nguyên “Hợp đồng thầu chính”</w:t>
             </w:r>
           </w:p>
         </w:tc>
@@ -1616,7 +1616,7 @@
                 <w:sz w:val="20"/>
                 <w:szCs w:val="20"/>
               </w:rPr>
-              <w:t xml:space="preserve">Chỉ bỏ định nghĩa 1.13 và cụm từ “Hợp đồng thầu chính”, “back to back” tại 1.22, 1.26, 8.2, 10.3.2b, 12.2.5a, 17.2a(iv); giữ nguyên toàn bộ nội dung khác (căn cứ Hợp đồng tổng thầu, ràng buộc thời hạn bảo hành không ngắn hơn cam kết với CĐT, các nghĩa vụ gắn với CĐT, TVGS)</w:t>
+              <w:t xml:space="preserve">Bản PH không còn câu chữ “back to back” nên không phát sinh sửa đổi; giữ nguyên căn cứ Hợp đồng tổng thầu, định nghĩa 1.13 và mọi dẫn chiếu Hợp đồng thầu chính (1.21, 1.25, 8.2, 10.3.2b, 12.2.5a, 17.2a(iv)), các nội dung liên quan TVGS</w:t>
             </w:r>
           </w:p>
         </w:tc>
@@ -3605,7 +3605,7 @@
                 <w:sz w:val="20"/>
                 <w:szCs w:val="20"/>
               </w:rPr>
-              <w:t xml:space="preserve">8.2: 36 tháng từ khi CĐT nghiệm thu hạng mục, không ngắn hơn thời hạn Bên A cam kết với CĐT (chỉ bỏ cụm “HĐ thầu chính”)</w:t>
+              <w:t xml:space="preserve">8.2: 36 tháng từ khi CĐT nghiệm thu hạng mục, không ngắn hơn thời hạn Bên A cam kết với CĐT (giữ nguyên dẫn chiếu Hợp đồng thầu chính)</w:t>
             </w:r>
           </w:p>
         </w:tc>
@@ -5858,7 +5858,7 @@
                 <w:sz w:val="20"/>
                 <w:szCs w:val="20"/>
               </w:rPr>
-              <w:t xml:space="preserve">Thanh toán quyết toán 20 ngày kể từ khi Bên A phê duyệt; điều kiện “Chủ đầu tư phê duyệt giá trị quyết toán phần việc tương ứng” vẫn giữ (không phải back to back theo nghĩa hợp đồng thầu chính).</w:t>
+              <w:t xml:space="preserve">Thanh toán quyết toán 20 ngày kể từ khi Bên A phê duyệt; giữ điều kiện Chủ đầu tư phê duyệt giá trị quyết toán phần việc tương ứng theo Hợp đồng thầu chính.</w:t>
             </w:r>
           </w:p>
         </w:tc>
@@ -6179,7 +6179,7 @@
                 <w:sz w:val="20"/>
                 <w:szCs w:val="20"/>
               </w:rPr>
-              <w:t xml:space="preserve">Bỏ thuật ngữ “HĐ thầu chính” nhưng giữ căn cứ chấm dứt khi hợp đồng của Bên A với CĐT chấm dứt – đây là lá chắn quan trọng, không nên bỏ.</w:t>
+              <w:t xml:space="preserve">Giữ nguyên căn cứ chấm dứt khi Hợp đồng thầu chính bị chấm dứt trước thời hạn – lá chắn quan trọng của Bên A, không nên nhượng bộ.</w:t>
             </w:r>
           </w:p>
         </w:tc>

</xml_diff>

<commit_message>
HĐ phần ngầm: bỏ trượt giá, đơn giá cố định (9.1, 15.3); đồng bộ bản FIDIC và báo cáo
Co-Authored-By: Claude Opus 5.5 <noreply@anthropic.com>
Claude-Session: https://claude.ai/code/session_013kfHyeUKSX8YviAMfNrZNJ
</commit_message>
<xml_diff>
--- a/3. DỰ THẢO HĐ/17.10.2026 Báo cáo rủi ro và kiến nghị FIDIC - HĐ phần ngầm sau thương thảo.docx
+++ b/3. DỰ THẢO HĐ/17.10.2026 Báo cáo rủi ro và kiến nghị FIDIC - HĐ phần ngầm sau thương thảo.docx
@@ -168,7 +168,7 @@
           <w:sz w:val="26"/>
           <w:szCs w:val="26"/>
         </w:rPr>
-        <w:t xml:space="preserve">- Bản gốc: bản chỉnh sửa của Phục Hưng (PH), đã chấp nhận toàn bộ sửa đổi của PH. Mọi điều chỉnh của Bên A thể hiện bằng track changes, tác giả “VNCN E&amp;C – Thương thảo 17/10”, kèm 31 ý kiến (comment) giải thích. Nhờ vậy PH chỉ cần xem phần khác với bản của chính họ.</w:t>
+        <w:t xml:space="preserve">- Bản gốc: bản chỉnh sửa của Phục Hưng (PH), đã chấp nhận toàn bộ sửa đổi của PH. Mọi điều chỉnh của Bên A thể hiện bằng track changes, tác giả “VNCN E&amp;C – Thương thảo 17/10”, kèm 32 ý kiến (comment) giải thích. Nhờ vậy PH chỉ cần xem phần khác với bản của chính họ.</w:t>
       </w:r>
     </w:p>
     <w:p>
@@ -210,7 +210,7 @@
           <w:sz w:val="26"/>
           <w:szCs w:val="26"/>
         </w:rPr>
-        <w:t xml:space="preserve">- Kết quả: 100 đoạn sửa, 107 đoạn xóa (phần lớn là chuyển vị trí), 31 đoạn chèn, 31 ý kiến. Kèm bản sạch đã chấp nhận toàn bộ thay đổi để đọc.</w:t>
+        <w:t xml:space="preserve">- Kết quả: 100 đoạn sửa, 107 đoạn xóa (phần lớn là chuyển vị trí), 31 đoạn chèn, 32 ý kiến. Kèm bản sạch đã chấp nhận toàn bộ thay đổi để đọc.</w:t>
       </w:r>
     </w:p>
     <w:p>
@@ -3712,7 +3712,7 @@
                 <w:sz w:val="20"/>
                 <w:szCs w:val="20"/>
               </w:rPr>
-              <w:t xml:space="preserve">15.3 Điều chỉnh giá trị HĐ (gồm công thức thép, bê tông ±5%)</w:t>
+              <w:t xml:space="preserve">15.3 Điều chỉnh giá trị HĐ; theo ý kiến Bên A ngày 19/10: bỏ trượt giá thép, bê tông – đơn giá cố định</w:t>
             </w:r>
           </w:p>
         </w:tc>
@@ -6945,7 +6945,7 @@
                 <w:sz w:val="20"/>
                 <w:szCs w:val="20"/>
               </w:rPr>
-              <w:t xml:space="preserve">15.3 Điều chỉnh giá</w:t>
+              <w:t xml:space="preserve">9.1, 15.3 Điều chỉnh giá</w:t>
             </w:r>
           </w:p>
         </w:tc>
@@ -6979,7 +6979,7 @@
                 <w:sz w:val="20"/>
                 <w:szCs w:val="20"/>
               </w:rPr>
-              <w:t xml:space="preserve">Hợp đồng ghi “đơn giá cố định” nhưng lại cho điều chỉnh thép, bê tông ±5% hằng tháng – mâu thuẫn về hình thức giá; Bên A gánh biến động giá mà không chắc thu lại được.</w:t>
+              <w:t xml:space="preserve">Đã xử lý (19/10): bỏ trượt giá thép, bê tông ±5%; hợp đồng đơn giá cố định, chỉ điều chỉnh khi pháp luật bắt buộc hoặc CĐT chấp thuận cho Bên A. Dự kiến PH phản đối vì đây là ý PH đưa vào.</w:t>
             </w:r>
           </w:p>
         </w:tc>
@@ -6992,7 +6992,6 @@
               <w:bottom w:val="single" w:color="808080" w:sz="4"/>
               <w:right w:val="single" w:color="808080" w:sz="4"/>
             </w:tcBorders>
-            <w:shd w:fill="F4B183" w:color="auto" w:val="clear"/>
             <w:tcMar>
               <w:top w:type="dxa" w:w="50"/>
               <w:left w:type="dxa" w:w="80"/>
@@ -7014,7 +7013,7 @@
                 <w:sz w:val="20"/>
                 <w:szCs w:val="20"/>
               </w:rPr>
-              <w:t xml:space="preserve">Cao</w:t>
+              <w:t xml:space="preserve">Trung bình</w:t>
             </w:r>
           </w:p>
         </w:tc>
@@ -10288,7 +10287,7 @@
                 <w:sz w:val="20"/>
                 <w:szCs w:val="20"/>
               </w:rPr>
-              <w:t xml:space="preserve">Hoặc bỏ điều chỉnh thép, bê tông để đúng hình thức “đơn giá cố định”; hoặc đổi hình thức thành “đơn giá điều chỉnh” chỉ cho thép, bê tông với: ngưỡng ±</w:t>
+              <w:t xml:space="preserve">Đã chọn phương án bỏ trượt giá, giữ đúng hình thức “đơn giá cố định”. Phương án lùi nếu PH không chấp nhận: đổi hình thức thành “đơn giá điều chỉnh” chỉ cho thép, bê tông với: ngưỡng ±</w:t>
             </w:r>
             <w:r>
               <w:rPr>

</xml_diff>